<commit_message>
Improve thesis figure readability and page layout
</commit_message>
<xml_diff>
--- a/tez-calisma-ciktilari-2026-10-20/GOKHAN-KAYA-TEZ-3-grafik-eklenmis.docx
+++ b/tez-calisma-ciktilari-2026-10-20/GOKHAN-KAYA-TEZ-3-grafik-eklenmis.docx
@@ -7785,8 +7785,11 @@
     </w:p>
     <w:p>
       <w:pPr>
-        <w:spacing w:line="360" w:lineRule="auto"/>
-        <w:jc w:val="both"/>
+        <w:keepNext/>
+        <w:keepLines/>
+        <w:spacing w:line="240" w:lineRule="auto" w:before="100" w:after="100"/>
+        <w:ind w:firstLine="0" w:left="0" w:right="0"/>
+        <w:jc w:val="center"/>
         <w:rPr>
           <w:rFonts w:ascii="Times New Roman" w:hAnsi="Times New Roman" w:cs="Times New Roman"/>
         </w:rPr>
@@ -7798,7 +7801,7 @@
         </w:rPr>
         <w:drawing>
           <wp:inline distT="0" distB="0" distL="0" distR="0" wp14:anchorId="2ACFFED5" wp14:editId="1B575E5B">
-            <wp:extent cx="5760720" cy="4069715"/>
+            <wp:extent cx="5616000" cy="3967476"/>
             <wp:effectExtent l="0" t="0" r="0" b="6985"/>
             <wp:docPr id="191566578" name="Resim 19"/>
             <wp:cNvGraphicFramePr>
@@ -7826,7 +7829,7 @@
                   <pic:spPr>
                     <a:xfrm>
                       <a:off x="0" y="0"/>
-                      <a:ext cx="5760720" cy="4069715"/>
+                      <a:ext cx="5616000" cy="3967476"/>
                     </a:xfrm>
                     <a:prstGeom prst="rect">
                       <a:avLst/>
@@ -7841,6 +7844,8 @@
     </w:p>
     <w:p>
       <w:pPr>
+        <w:keepNext w:val="0"/>
+        <w:keepLines/>
         <w:jc w:val="both"/>
         <w:rPr>
           <w:rFonts w:ascii="Times New Roman" w:hAnsi="Times New Roman" w:cs="Times New Roman"/>
@@ -10574,7 +10579,11 @@
     </w:p>
     <w:p>
       <w:pPr>
-        <w:jc w:val="both"/>
+        <w:keepNext/>
+        <w:keepLines/>
+        <w:spacing w:line="240" w:lineRule="auto" w:before="100" w:after="100"/>
+        <w:ind w:firstLine="0" w:left="0" w:right="0"/>
+        <w:jc w:val="center"/>
         <w:rPr>
           <w:rFonts w:ascii="Times New Roman" w:hAnsi="Times New Roman" w:cs="Times New Roman"/>
         </w:rPr>
@@ -10586,7 +10595,7 @@
         </w:rPr>
         <w:drawing>
           <wp:inline distT="0" distB="0" distL="0" distR="0" wp14:anchorId="5D77DA1A" wp14:editId="59F6F2DB">
-            <wp:extent cx="5130165" cy="8892540"/>
+            <wp:extent cx="5616000" cy="6461583"/>
             <wp:effectExtent l="0" t="0" r="0" b="3810"/>
             <wp:docPr id="50573405" name="Resim 1"/>
             <wp:cNvGraphicFramePr>
@@ -10608,7 +10617,7 @@
                   <pic:spPr>
                     <a:xfrm>
                       <a:off x="0" y="0"/>
-                      <a:ext cx="5130165" cy="8892540"/>
+                      <a:ext cx="5616000" cy="6461583"/>
                     </a:xfrm>
                     <a:prstGeom prst="rect">
                       <a:avLst/>
@@ -10623,6 +10632,8 @@
     </w:p>
     <w:p>
       <w:pPr>
+        <w:keepNext/>
+        <w:keepLines/>
         <w:jc w:val="both"/>
         <w:rPr>
           <w:rFonts w:ascii="Times New Roman" w:hAnsi="Times New Roman" w:cs="Times New Roman"/>
@@ -10661,6 +10672,7 @@
     </w:p>
     <w:p>
       <w:pPr>
+        <w:keepNext w:val="0"/>
         <w:jc w:val="both"/>
         <w:rPr>
           <w:rFonts w:ascii="Times New Roman" w:hAnsi="Times New Roman" w:cs="Times New Roman"/>
@@ -12876,8 +12888,11 @@
     </w:p>
     <w:p>
       <w:pPr>
-        <w:spacing w:line="360" w:lineRule="auto"/>
-        <w:jc w:val="both"/>
+        <w:keepNext/>
+        <w:keepLines/>
+        <w:spacing w:line="240" w:lineRule="auto" w:before="100" w:after="100"/>
+        <w:ind w:firstLine="0" w:left="0" w:right="0"/>
+        <w:jc w:val="center"/>
         <w:rPr>
           <w:rFonts w:ascii="Times New Roman" w:hAnsi="Times New Roman" w:cs="Times New Roman"/>
           <w:bCs/>
@@ -12895,7 +12910,7 @@
         </w:rPr>
         <w:drawing>
           <wp:inline distT="0" distB="0" distL="0" distR="0" wp14:anchorId="786514DE" wp14:editId="7216B3B9">
-            <wp:extent cx="6367271" cy="3979545"/>
+            <wp:extent cx="5616000" cy="6259996"/>
             <wp:effectExtent l="0" t="0" r="0" b="1905"/>
             <wp:docPr id="562854891" name="Resim 1"/>
             <wp:cNvGraphicFramePr>
@@ -12917,7 +12932,7 @@
                   <pic:spPr>
                     <a:xfrm>
                       <a:off x="0" y="0"/>
-                      <a:ext cx="6373448" cy="3983406"/>
+                      <a:ext cx="5616000" cy="6259996"/>
                     </a:xfrm>
                     <a:prstGeom prst="rect">
                       <a:avLst/>
@@ -12932,6 +12947,8 @@
     </w:p>
     <w:p>
       <w:pPr>
+        <w:keepNext w:val="0"/>
+        <w:keepLines/>
         <w:spacing w:line="360" w:lineRule="auto"/>
         <w:jc w:val="both"/>
         <w:rPr>
@@ -15249,12 +15266,15 @@
     <w:p>
       <w:pPr>
         <w:keepNext/>
+        <w:keepLines/>
+        <w:spacing w:line="240" w:lineRule="auto" w:before="100" w:after="100"/>
+        <w:ind w:firstLine="0" w:left="0" w:right="0"/>
         <w:jc w:val="center"/>
       </w:pPr>
       <w:r>
         <w:drawing>
           <wp:inline xmlns:a="http://schemas.openxmlformats.org/drawingml/2006/main" xmlns:pic="http://schemas.openxmlformats.org/drawingml/2006/picture">
-            <wp:extent cx="5580000" cy="2649644"/>
+            <wp:extent cx="5616000" cy="3109399"/>
             <wp:docPr id="562854894" name="Picture 562854894"/>
             <wp:cNvGraphicFramePr>
               <a:graphicFrameLocks noChangeAspect="1"/>
@@ -15275,7 +15295,7 @@
                   <pic:spPr>
                     <a:xfrm>
                       <a:off x="0" y="0"/>
-                      <a:ext cx="5580000" cy="2649644"/>
+                      <a:ext cx="5616000" cy="3109399"/>
                     </a:xfrm>
                     <a:prstGeom prst="rect"/>
                   </pic:spPr>
@@ -19867,13 +19887,14 @@
       <w:pPr>
         <w:keepNext/>
         <w:keepLines/>
-        <w:spacing w:after="60"/>
+        <w:spacing w:after="100" w:line="240" w:lineRule="auto" w:before="100"/>
+        <w:ind w:firstLine="0" w:left="0" w:right="0"/>
         <w:jc w:val="center"/>
       </w:pPr>
       <w:r>
         <w:drawing>
           <wp:inline xmlns:a="http://schemas.openxmlformats.org/drawingml/2006/main" xmlns:pic="http://schemas.openxmlformats.org/drawingml/2006/picture">
-            <wp:extent cx="5580000" cy="2857381"/>
+            <wp:extent cx="5616000" cy="3527888"/>
             <wp:docPr id="562854892" name="Picture 562854892"/>
             <wp:cNvGraphicFramePr>
               <a:graphicFrameLocks noChangeAspect="1"/>
@@ -19894,7 +19915,7 @@
                   <pic:spPr>
                     <a:xfrm>
                       <a:off x="0" y="0"/>
-                      <a:ext cx="5580000" cy="2857381"/>
+                      <a:ext cx="5616000" cy="3527888"/>
                     </a:xfrm>
                     <a:prstGeom prst="rect"/>
                   </pic:spPr>
@@ -22390,13 +22411,14 @@
       <w:pPr>
         <w:keepNext/>
         <w:keepLines/>
-        <w:spacing w:after="60"/>
+        <w:spacing w:after="100" w:line="240" w:lineRule="auto" w:before="100"/>
+        <w:ind w:firstLine="0" w:left="0" w:right="0"/>
         <w:jc w:val="center"/>
       </w:pPr>
       <w:r>
         <w:drawing>
           <wp:inline xmlns:a="http://schemas.openxmlformats.org/drawingml/2006/main" xmlns:pic="http://schemas.openxmlformats.org/drawingml/2006/picture">
-            <wp:extent cx="5580000" cy="2844662"/>
+            <wp:extent cx="5616000" cy="3527888"/>
             <wp:docPr id="562854893" name="Picture 562854893"/>
             <wp:cNvGraphicFramePr>
               <a:graphicFrameLocks noChangeAspect="1"/>
@@ -22417,7 +22439,7 @@
                   <pic:spPr>
                     <a:xfrm>
                       <a:off x="0" y="0"/>
-                      <a:ext cx="5580000" cy="2844662"/>
+                      <a:ext cx="5616000" cy="3527888"/>
                     </a:xfrm>
                     <a:prstGeom prst="rect"/>
                   </pic:spPr>

</xml_diff>